<commit_message>
Push latest Main Alice source code
</commit_message>
<xml_diff>
--- a/Documents/ALICE-1.0-Advanced-Guide.docx
+++ b/Documents/ALICE-1.0-Advanced-Guide.docx
@@ -6,6 +6,8 @@
       <w:pPr>
         <w:pStyle w:val="Heading1"/>
       </w:pPr>
+      <w:bookmarkStart w:id="0" w:name="_GoBack"/>
+      <w:bookmarkEnd w:id="0"/>
       <w:r>
         <w:t>A</w:t>
       </w:r>
@@ -469,8 +471,6 @@
         </w:rPr>
         <w:t>w</w:t>
       </w:r>
-      <w:bookmarkStart w:id="0" w:name="_GoBack"/>
-      <w:bookmarkEnd w:id="0"/>
       <w:r>
         <w:rPr>
           <w:rFonts w:ascii="Arial" w:hAnsi="Arial" w:cs="Arial"/>
@@ -27293,7 +27293,7 @@
 </file>
 
 <file path=customXml/itemProps1.xml><?xml version="1.0" encoding="utf-8"?>
-<ds:datastoreItem xmlns:ds="http://schemas.openxmlformats.org/officeDocument/2006/customXml" ds:itemID="{7A0B4128-0C44-44E3-8FD0-91297F4E9B04}">
+<ds:datastoreItem xmlns:ds="http://schemas.openxmlformats.org/officeDocument/2006/customXml" ds:itemID="{590222A7-27D6-40C3-A51F-6FF7BF8691FE}">
   <ds:schemaRefs>
     <ds:schemaRef ds:uri="http://schemas.openxmlformats.org/officeDocument/2006/bibliography"/>
   </ds:schemaRefs>

</xml_diff>